<commit_message>
Refocus presentation on compiler passes and engineering contributions
</commit_message>
<xml_diff>
--- a/docs/video/recording-script.docx
+++ b/docs/video/recording-script.docx
@@ -12,7 +12,7 @@
     </w:p>
     <w:p>
       <w:r>
-        <w:t>359 spoken words · six visual scenes · finish speaking by 2:55, then hold for five seconds. Record one clean, continuous take with no background music. Read only the narration below; the timecodes and visual cues are for rehearsal.</w:t>
+        <w:t>355 spoken words · 9 visual scenes · finish speaking by 2:55, then hold for five seconds. Record one clean, continuous take with no background music. Read only the narration below; the timecodes and visual cues are for rehearsal.</w:t>
       </w:r>
     </w:p>
     <w:p>
@@ -20,12 +20,12 @@
         <w:pStyle w:val="Heading2"/>
       </w:pPr>
       <w:r>
-        <w:t>0:00–0:20  |  Slide 1: Scheduled IR to RTX 5090</w:t>
+        <w:t>0:00–0:12  |  Slide 1: The compiler transformations we built</w:t>
       </w:r>
     </w:p>
     <w:p>
       <w:r>
-        <w:t>A fast GPU still needs a good schedule. We built Deuteron to compile scheduled Emmy Kernel IR into PTX for the RTX 5090. We reduce repeated work and memory traffic while preserving each workload's original launch, inputs, and numerical tolerances.</w:t>
+        <w:t>Deuteron compiles scheduled Emmy Kernel IR into PTX for the RTX 5090. Our contribution is guarded compiler passes that change memory reuse, parallel work, and tensor pipelines.</w:t>
       </w:r>
     </w:p>
     <w:p>
@@ -34,7 +34,7 @@
           <w:color w:val="637083"/>
           <w:sz w:val="20"/>
         </w:rPr>
-        <w:t>Cue: Presenter opening, then slide 1. Pause after “good schedule.”</w:t>
+        <w:t>Cue: Open on the presenter, then the title. Point to reuse, parallel work, and tensor pipelines.</w:t>
       </w:r>
     </w:p>
     <w:p>
@@ -42,12 +42,12 @@
         <w:pStyle w:val="Heading2"/>
       </w:pPr>
       <w:r>
-        <w:t>0:20–0:50  |  Slide 2: Structure, guards, and LLVM</w:t>
+        <w:t>0:12–0:27  |  Slide 2: Where our passes run</w:t>
       </w:r>
     </w:p>
     <w:p>
       <w:r>
-        <w:t>First, we validate the kernel and launch metadata. Custom passes then recognize reusable loads, cooperative reductions, and matrix pipelines. Each rewrite checks shapes, ownership, and dependencies; if its proof fails, supported code keeps the generic path. We lower the result into typed LLVM IR. LLVM supplies optimization and the NVPTX backend; our contribution is the GPU analysis, guarded transformations, and lowering.</w:t>
+        <w:t>We validate IR and metadata; each rewrite checks index and ownership conditions. Early passes vectorize loops, forward reduction inputs, reorder recurrences, and fold split-K grids. Specialized lowering follows; LLVM supplies optimization and NVPTX code generation.</w:t>
       </w:r>
     </w:p>
     <w:p>
@@ -56,7 +56,7 @@
           <w:color w:val="637083"/>
           <w:sz w:val="20"/>
         </w:rPr>
-        <w:t>Cue: Slide 2 pipeline. Give the LLVM credit its own breath.</w:t>
+        <w:t>Cue: Follow the pipeline. Say the LLVM credit clearly.</w:t>
       </w:r>
     </w:p>
     <w:p>
@@ -64,12 +64,12 @@
         <w:pStyle w:val="Heading2"/>
       </w:pPr>
       <w:r>
-        <w:t>0:50–1:25  |  Slide 3: Tensor cores, copies, and types</w:t>
+        <w:t>0:27–0:44  |  Slide 3: Reuse data before loading it again</w:t>
       </w:r>
     </w:p>
     <w:p>
       <w:r>
-        <w:t>For matrix multiplication, we use compensated BF16x3 or TF32x3 tensor products. Buffers and accumulation stay FP32; lower precision is internal, and these modes remain approximations. Ordinary FP32 multiplication is available too. Asynchronous global-to-shared copies, with explicit waits and barriers, let computation overlap data movement. A separate FP16 storage path provides exact widening and nearest-even narrowing, with explicit FP32 arithmetic. The focus is reducing memory traffic and feeding the hardware effectively.</w:t>
+        <w:t>Elementwise vectorization packs four values per lane. Reduction load forwarding keeps inputs in registers for the consumer instead of loading them again. Coalesced sum and square reductions use contiguous loads; long eligible loops add independent accumulators.</w:t>
       </w:r>
     </w:p>
     <w:p>
@@ -78,7 +78,7 @@
           <w:color w:val="637083"/>
           <w:sz w:val="20"/>
         </w:rPr>
-        <w:t>Cue: Slide 3 hardware columns. Say the tensor names slowly.</w:t>
+        <w:t>Cue: Trace the retained vector through reduction and consumer.</w:t>
       </w:r>
     </w:p>
     <w:p>
@@ -91,12 +91,12 @@
         <w:pStyle w:val="Heading2"/>
       </w:pPr>
       <w:r>
-        <w:t>1:25–1:50  |  Slide 4: Compile it, inspect it</w:t>
+        <w:t>0:44–1:03  |  Slide 4: Reshape parallel work</w:t>
       </w:r>
     </w:p>
     <w:p>
       <w:r>
-        <w:t>Let's compile the standalone matrix example in TF32x3 mode for the 5090. Compilation runs on the CPU, using only the scheduled IR and its adjacent launch metadata. The generated PTX contains mma.sync tensor instructions and cp.async copies. These are actual compiler outputs. This command only compiles; GPU correctness is tested separately.</w:t>
+        <w:t>Cooperative dot reduction shares a repeated dot across lanes and combines partials with shuffles. Small-tree elimination removes redundant reduction stages. Split-K grid folding merges eligible K partitions into deeper work per block while preserving the original physical grid.</w:t>
       </w:r>
     </w:p>
     <w:p>
@@ -105,7 +105,7 @@
           <w:color w:val="637083"/>
           <w:sz w:val="20"/>
         </w:rPr>
-        <w:t>Cue: Slide 4, real PTX capture. Leave both instruction lines visible.</w:t>
+        <w:t>Cue: Show lane cooperation, then folded K work and inactive surplus blocks.</w:t>
       </w:r>
     </w:p>
     <w:p>
@@ -113,12 +113,12 @@
         <w:pStyle w:val="Heading2"/>
       </w:pPr>
       <w:r>
-        <w:t>1:50–2:30  |  Slide 5: Measured on the open set</w:t>
+        <w:t>1:03–1:26  |  Slide 5: Turn contractions into tensor work</w:t>
       </w:r>
     </w:p>
     <w:p>
       <w:r>
-        <w:t>Across fifteen open workloads, Deuteron's geometric mean warm latency is three point seven five microseconds. That's a one point six six times speedup over generated CUDA compiled with NVCC, and one point one five times over the tested Triton baseline. We used two hundred seventy calls with balanced execution order, checking every output against the original references and tolerances. Raw samples and artifacts are included. Compilation, assembly, and network time are excluded. These are warm kernel timings on this set, with a limited Triton search.</w:t>
+        <w:t>Contraction tensorization recognizes a closed shared-memory multiply-add and emits compensated BF16x3 or TF32x3 products. Three high and residual products accumulate in FP32; omitting low times low makes this approximate. Shared-memory layout matches producers to MMA fragments. Separate FP16 storage uses explicit FP32 arithmetic.</w:t>
       </w:r>
     </w:p>
     <w:p>
@@ -127,7 +127,7 @@
           <w:color w:val="637083"/>
           <w:sz w:val="20"/>
         </w:rPr>
-        <w:t>Cue: Slide 5 chart. Slow for the ratios; keep the warm and baseline qualifiers.</w:t>
+        <w:t>Cue: Explain the three products. Keep the FP16 strip separate from tensor operands.</w:t>
       </w:r>
     </w:p>
     <w:p>
@@ -135,12 +135,12 @@
         <w:pStyle w:val="Heading2"/>
       </w:pPr>
       <w:r>
-        <w:t>2:30–2:55  |  Slide 6: Reliability and an explicit scope</w:t>
+        <w:t>1:26–1:49  |  Slide 6: Rewrite the pipeline feeding tensor cores</w:t>
       </w:r>
     </w:p>
     <w:p>
       <w:r>
-        <w:t>We also ship an installable command, restricted parsing, validated interfaces, and corruption-tolerant caches. All one hundred and three tests passed with GPU checks enabled on H100; eleven feature examples passed on the 5090. Scope stays explicit: supported scheduled IR and documented numerical modes. Deuteron makes GPU compiler decisions visible, reproducible, and measurable.</w:t>
+        <w:t>Packed register staging replaces a certified FP32 copy ring for BF16 lowering with vector prefetch, high and residual packing, and one used shared stage. Fragment pipelining loads the next MMA fragment early. Pipeline drain skips unused final prefetches. Other eligible paths retain asynchronous copies.</w:t>
       </w:r>
     </w:p>
     <w:p>
@@ -149,12 +149,83 @@
           <w:color w:val="637083"/>
           <w:sz w:val="20"/>
         </w:rPr>
-        <w:t>Cue: Slide 6 and presenter close. Separate the H100 and RTX test counts.</w:t>
+        <w:t>Cue: Compare the two paths. The packed BF16 path replaces the asynchronous ring.</w:t>
       </w:r>
     </w:p>
     <w:p>
       <w:r>
-        <w:t>2:55–3:00: stop speaking; hold slide 6. Leave extra silence on the raw recording for editing. The full recording setup, pronunciation notes, optional cuts, and edit plan are in the companion Markdown files.</w:t>
+        <w:br w:type="page"/>
+      </w:r>
+    </w:p>
+    <w:p>
+      <w:pPr>
+        <w:pStyle w:val="Heading2"/>
+      </w:pPr>
+      <w:r>
+        <w:t>1:49–2:12  |  Slide 7: Recognize and stage the attention recurrence</w:t>
+      </w:r>
+    </w:p>
+    <w:p>
+      <w:r>
+        <w:t>Staged online recurrence computes attention scores once per sharing group, then materializes unnormalized weights for mass and value accumulation. Blocked recurrence loads group adjacent keys. Shared-storage reuse overwrites dead operands only when warp ownership and dependency checks make it safe.</w:t>
+      </w:r>
+    </w:p>
+    <w:p>
+      <w:r>
+        <w:rPr>
+          <w:color w:val="637083"/>
+          <w:sz w:val="20"/>
+        </w:rPr>
+        <w:t>Cue: Follow scores to weights to mass and PV. Then show guarded storage reuse.</w:t>
+      </w:r>
+    </w:p>
+    <w:p>
+      <w:pPr>
+        <w:pStyle w:val="Heading2"/>
+      </w:pPr>
+      <w:r>
+        <w:t>2:12–2:30  |  Slide 8: Redistribute probability–value work</w:t>
+      </w:r>
+    </w:p>
+    <w:p>
+      <w:r>
+        <w:t>Warp-distributed vector PV reduction targets one warp and thirty-two columns. Four groups split the keys; each lane accumulates four adjacent columns. Shuffles combine the groups. The original output suffix is replayed, restoring the denominator before every column.</w:t>
+      </w:r>
+    </w:p>
+    <w:p>
+      <w:r>
+        <w:rPr>
+          <w:color w:val="637083"/>
+          <w:sz w:val="20"/>
+        </w:rPr>
+        <w:t>Cue: Trace four key shards into the first eight writing lanes.</w:t>
+      </w:r>
+    </w:p>
+    <w:p>
+      <w:pPr>
+        <w:pStyle w:val="Heading2"/>
+      </w:pPr>
+      <w:r>
+        <w:t>2:30–2:55  |  Slide 9: Measure the whole compiler on RTX 5090</w:t>
+      </w:r>
+    </w:p>
+    <w:p>
+      <w:r>
+        <w:t>On fifteen open workloads, geometric mean warm latency is three point seven five microseconds. Speedups are one point six six times over generated CUDA with NVCC, and one point one five times over the tested Triton baseline. All two hundred seventy calls passed the original checks. These are whole-compiler results with a limited Triton search.</w:t>
+      </w:r>
+    </w:p>
+    <w:p>
+      <w:r>
+        <w:rPr>
+          <w:color w:val="637083"/>
+          <w:sz w:val="20"/>
+        </w:rPr>
+        <w:t>Cue: Slow for the ratios. Hold the results slide silently from 2:55 to 3:00.</w:t>
+      </w:r>
+    </w:p>
+    <w:p>
+      <w:r>
+        <w:t>2:55–3:00: stop speaking; hold slide 9. Leave extra silence on the raw recording for editing. The full recording setup, pronunciation notes, optional cuts, and edit plan are in the companion Markdown files.</w:t>
       </w:r>
     </w:p>
     <w:sectPr>

</xml_diff>

<commit_message>
Simplify slide 3–8 recording narration and refresh script exports
</commit_message>
<xml_diff>
--- a/docs/video/recording-script.docx
+++ b/docs/video/recording-script.docx
@@ -69,7 +69,7 @@
     </w:p>
     <w:p>
       <w:r>
-        <w:t>Elementwise vectorization packs four values per lane. Reduction load forwarding keeps inputs in registers for the consumer instead of loading them again. Coalesced sum and square reductions use contiguous loads; long eligible loops add independent accumulators.</w:t>
+        <w:t>We look for repeated reads of the same input, or neighboring values loaded one at a time. We keep reusable values in registers and load nearby values together. That means fewer repeated trips to global memory.</w:t>
       </w:r>
     </w:p>
     <w:p>
@@ -78,7 +78,7 @@
           <w:color w:val="637083"/>
           <w:sz w:val="20"/>
         </w:rPr>
-        <w:t>Cue: Trace the retained vector through reduction and consumer.</w:t>
+        <w:t>Cue: Point to the repeated read, then show the saved values being reused.</w:t>
       </w:r>
     </w:p>
     <w:p>
@@ -96,7 +96,7 @@
     </w:p>
     <w:p>
       <w:r>
-        <w:t>Cooperative dot reduction shares a repeated dot across lanes and combines partials with shuffles. Small-tree elimination removes redundant reduction stages. Split-K grid folding merges eligible K partitions into deeper work per block while preserving the original physical grid.</w:t>
+        <w:t>We look for repeated calculations and blocks doing tiny pieces of work. We share dot products across threads, remove unnecessary reduction steps, and merge small pieces when enough parallel work remains. That reduces duplicated work and scheduling overhead.</w:t>
       </w:r>
     </w:p>
     <w:p>
@@ -105,7 +105,7 @@
           <w:color w:val="637083"/>
           <w:sz w:val="20"/>
         </w:rPr>
-        <w:t>Cue: Show lane cooperation, then folded K work and inactive surplus blocks.</w:t>
+        <w:t>Cue: Show repeated work becoming shared work, then small pieces being combined.</w:t>
       </w:r>
     </w:p>
     <w:p>
@@ -118,7 +118,7 @@
     </w:p>
     <w:p>
       <w:r>
-        <w:t>Contraction tensorization recognizes a closed shared-memory multiply-add and emits compensated BF16x3 or TF32x3 products. Three high and residual products accumulate in FP32; omitting low times low makes this approximate. Shared-memory layout matches producers to MMA fragments. Separate FP16 storage uses explicit FP32 arithmetic.</w:t>
+        <w:t>We look for matrix multiplication written as ordinary multiply-and-add loops. We replace them with tensor-core operations, using three lower-precision products to approximate the result while adding them together in 32-bit precision. We also arrange shared memory so tensor cores can read it efficiently.</w:t>
       </w:r>
     </w:p>
     <w:p>
@@ -127,7 +127,7 @@
           <w:color w:val="637083"/>
           <w:sz w:val="20"/>
         </w:rPr>
-        <w:t>Cue: Explain the three products. Keep the FP16 strip separate from tensor operands.</w:t>
+        <w:t>Cue: Follow the loop into tensor-core operations. Say that the result is approximate.</w:t>
       </w:r>
     </w:p>
     <w:p>
@@ -140,7 +140,7 @@
     </w:p>
     <w:p>
       <w:r>
-        <w:t>Packed register staging replaces a certified FP32 copy ring for BF16 lowering with vector prefetch, high and residual packing, and one used shared stage. Fragment pipelining loads the next MMA fragment early. Pipeline drain skips unused final prefetches. Other eligible paths retain asynchronous copies.</w:t>
+        <w:t>We look for tensor-core loops that repeatedly copy and convert their matrix inputs. For the supported BF16 path, we fetch upcoming inputs early and pack them before the tensor cores need them. We also skip the final prefetch when there is no more work.</w:t>
       </w:r>
     </w:p>
     <w:p>
@@ -149,7 +149,7 @@
           <w:color w:val="637083"/>
           <w:sz w:val="20"/>
         </w:rPr>
-        <w:t>Cue: Compare the two paths. The packed BF16 path replaces the asynchronous ring.</w:t>
+        <w:t>Cue: Show the next inputs arriving early, then the unused final load being removed.</w:t>
       </w:r>
     </w:p>
     <w:p>
@@ -167,7 +167,7 @@
     </w:p>
     <w:p>
       <w:r>
-        <w:t>Staged online recurrence computes attention scores once per sharing group, then materializes unnormalized weights for mass and value accumulation. Blocked recurrence loads group adjacent keys. Shared-storage reuse overwrites dead operands only when warp ownership and dependency checks make it safe.</w:t>
+        <w:t>We look for attention loops that repeat the score calculation across output columns. We calculate scores once per group and reuse their weights. We also load neighboring keys together and reuse temporary storage once its values are no longer needed.</w:t>
       </w:r>
     </w:p>
     <w:p>
@@ -176,7 +176,7 @@
           <w:color w:val="637083"/>
           <w:sz w:val="20"/>
         </w:rPr>
-        <w:t>Cue: Follow scores to weights to mass and PV. Then show guarded storage reuse.</w:t>
+        <w:t>Cue: Show one score calculation feeding several outputs, then temporary storage being reused.</w:t>
       </w:r>
     </w:p>
     <w:p>
@@ -189,7 +189,7 @@
     </w:p>
     <w:p>
       <w:r>
-        <w:t>Warp-distributed vector PV reduction targets one warp and thirty-two columns. Four groups split the keys; each lane accumulates four adjacent columns. Shuffles combine the groups. The original output suffix is replayed, restoring the denominator before every column.</w:t>
+        <w:t>We look for attention loops where each thread scans every key for one output column. We split keys among thread groups, load four adjacent columns together, and combine their partial results. Each column keeps its original normalization.</w:t>
       </w:r>
     </w:p>
     <w:p>
@@ -198,7 +198,7 @@
           <w:color w:val="637083"/>
           <w:sz w:val="20"/>
         </w:rPr>
-        <w:t>Cue: Trace four key shards into the first eight writing lanes.</w:t>
+        <w:t>Cue: Show the keys split among groups, then their partial results being combined.</w:t>
       </w:r>
     </w:p>
     <w:p>

</xml_diff>